<commit_message>
Update repro_tools: per-language/per-GPU node splitting, model/subset options
</commit_message>
<xml_diff>
--- a/repro_tools/XMAD-Bench_Reproducibility_Log.docx
+++ b/repro_tools/XMAD-Bench_Reproducibility_Log.docx
@@ -13,7 +13,7 @@
           <w:sz w:val="34"/>
           <w:szCs w:val="34"/>
         </w:rPr>
-        <w:t xml:space="preserve">Reproducibility Log — XMAD-Bench (German / ResNet-18)</w:t>
+        <w:t xml:space="preserve">Reproducibility Log — XMAD-Bench (German: ResNet-18 &amp; ResNet-50)</w:t>
       </w:r>
     </w:p>
     <w:p>
@@ -74,7 +74,7 @@
           <w:sz w:val="21"/>
           <w:szCs w:val="21"/>
         </w:rPr>
-        <w:t xml:space="preserve">The XMAD-Bench detection experiment was reproduced end-to-end for German with the ResNet-18 detector. The released code did not run as-is and required four documented changes (three code-compatibility fixes plus one Apple-GPU accommodation); none alter the method. After the fixes, a quick smoke test and then three full 20-epoch runs on the complete German data were executed on an Apple-Silicon MacBook using the MPS backend. The reproduced results closely match the paper: in-domain accuracy 99.73% (paper 100%) and cross-domain accuracy 96.99% (paper 90.3% ± 6.1). The paper's central finding — near-perfect in-domain performance with a drop cross-domain — was reproduced. The main disclosed deviation is batch size 64 (paper used 200 for ResNet-18) due to laptop memory.</w:t>
+        <w:t xml:space="preserve">The XMAD-Bench detection experiment was reproduced end-to-end for German with two detectors, ResNet-18 and ResNet-50. The released code did not run as-is and required four documented changes (three code-compatibility fixes plus one Apple-GPU accommodation); none alter the method. After the fixes, a quick smoke test and then three full 20-epoch runs per model on the complete German data were executed on an Apple-Silicon MacBook using the MPS backend. Both models reproduced closely: ResNet-18 in-domain 99.73% / cross-domain 96.99% (paper 100% / 90.3% ± 6.1); ResNet-50 in-domain 99.98% / cross-domain 97.10% (paper 100% / 96.96% ± 1.1). The paper's central finding — near-perfect in-domain performance with a drop cross-domain — was reproduced for both, and the two CNNs agree with each other (~97% cross-domain). Disclosed deviations are reduced batch sizes (ResNet-18 64 vs 200; ResNet-50 32 vs 120) due to laptop memory.</w:t>
       </w:r>
     </w:p>
     <w:p>
@@ -3995,6 +3995,1250 @@
     </w:p>
     <w:p>
       <w:pPr>
+        <w:pStyle w:val="Heading2"/>
+      </w:pPr>
+      <w:r>
+        <w:t xml:space="preserve">6.4 Full German ResNet-50 runs (3 x 20 epochs, full data)</w:t>
+      </w:r>
+    </w:p>
+    <w:p>
+      <w:pPr>
+        <w:spacing w:after="120" w:before="0"/>
+      </w:pPr>
+      <w:r>
+        <w:rPr>
+          <w:sz w:val="21"/>
+          <w:szCs w:val="21"/>
+        </w:rPr>
+        <w:t xml:space="preserve">Same procedure as ResNet-18, model_type=resnet50, batch_size 32 (paper 120). Measured duration ~85 min per run on MPS (larger network + smaller batch =&gt; more iterations).</w:t>
+      </w:r>
+    </w:p>
+    <w:tbl>
+      <w:tblPr>
+        <w:tblW w:type="dxa" w:w="9360"/>
+        <w:tblBorders>
+          <w:top w:val="single" w:color="auto" w:sz="4"/>
+          <w:left w:val="single" w:color="auto" w:sz="4"/>
+          <w:bottom w:val="single" w:color="auto" w:sz="4"/>
+          <w:right w:val="single" w:color="auto" w:sz="4"/>
+          <w:insideH w:val="single" w:color="auto" w:sz="4"/>
+          <w:insideV w:val="single" w:color="auto" w:sz="4"/>
+        </w:tblBorders>
+      </w:tblPr>
+      <w:tblGrid>
+        <w:gridCol w:w="1400"/>
+        <w:gridCol w:w="2000"/>
+        <w:gridCol w:w="2000"/>
+        <w:gridCol w:w="2000"/>
+        <w:gridCol w:w="1960"/>
+      </w:tblGrid>
+      <w:tr>
+        <w:trPr>
+          <w:tblHeader/>
+        </w:trPr>
+        <w:tc>
+          <w:tcPr>
+            <w:tcW w:type="dxa" w:w="1400"/>
+            <w:tcBorders>
+              <w:top w:val="single" w:color="CCCCCC" w:sz="1"/>
+              <w:left w:val="single" w:color="CCCCCC" w:sz="1"/>
+              <w:bottom w:val="single" w:color="CCCCCC" w:sz="1"/>
+              <w:right w:val="single" w:color="CCCCCC" w:sz="1"/>
+            </w:tcBorders>
+            <w:shd w:fill="D5E8F0" w:val="clear"/>
+            <w:tcMar>
+              <w:top w:type="dxa" w:w="60"/>
+              <w:left w:type="dxa" w:w="110"/>
+              <w:bottom w:type="dxa" w:w="60"/>
+              <w:right w:type="dxa" w:w="110"/>
+            </w:tcMar>
+          </w:tcPr>
+          <w:p>
+            <w:r>
+              <w:rPr>
+                <w:rFonts w:ascii="Arial" w:cs="Arial" w:eastAsia="Arial" w:hAnsi="Arial"/>
+                <w:b/>
+                <w:bCs/>
+                <w:sz w:val="18"/>
+                <w:szCs w:val="18"/>
+              </w:rPr>
+              <w:t xml:space="preserve">Run</w:t>
+            </w:r>
+          </w:p>
+        </w:tc>
+        <w:tc>
+          <w:tcPr>
+            <w:tcW w:type="dxa" w:w="2000"/>
+            <w:tcBorders>
+              <w:top w:val="single" w:color="CCCCCC" w:sz="1"/>
+              <w:left w:val="single" w:color="CCCCCC" w:sz="1"/>
+              <w:bottom w:val="single" w:color="CCCCCC" w:sz="1"/>
+              <w:right w:val="single" w:color="CCCCCC" w:sz="1"/>
+            </w:tcBorders>
+            <w:shd w:fill="D5E8F0" w:val="clear"/>
+            <w:tcMar>
+              <w:top w:type="dxa" w:w="60"/>
+              <w:left w:type="dxa" w:w="110"/>
+              <w:bottom w:type="dxa" w:w="60"/>
+              <w:right w:type="dxa" w:w="110"/>
+            </w:tcMar>
+          </w:tcPr>
+          <w:p>
+            <w:r>
+              <w:rPr>
+                <w:rFonts w:ascii="Arial" w:cs="Arial" w:eastAsia="Arial" w:hAnsi="Arial"/>
+                <w:b/>
+                <w:bCs/>
+                <w:sz w:val="18"/>
+                <w:szCs w:val="18"/>
+              </w:rPr>
+              <w:t xml:space="preserve">In-domain ACC</w:t>
+            </w:r>
+          </w:p>
+        </w:tc>
+        <w:tc>
+          <w:tcPr>
+            <w:tcW w:type="dxa" w:w="2000"/>
+            <w:tcBorders>
+              <w:top w:val="single" w:color="CCCCCC" w:sz="1"/>
+              <w:left w:val="single" w:color="CCCCCC" w:sz="1"/>
+              <w:bottom w:val="single" w:color="CCCCCC" w:sz="1"/>
+              <w:right w:val="single" w:color="CCCCCC" w:sz="1"/>
+            </w:tcBorders>
+            <w:shd w:fill="D5E8F0" w:val="clear"/>
+            <w:tcMar>
+              <w:top w:type="dxa" w:w="60"/>
+              <w:left w:type="dxa" w:w="110"/>
+              <w:bottom w:type="dxa" w:w="60"/>
+              <w:right w:type="dxa" w:w="110"/>
+            </w:tcMar>
+          </w:tcPr>
+          <w:p>
+            <w:r>
+              <w:rPr>
+                <w:rFonts w:ascii="Arial" w:cs="Arial" w:eastAsia="Arial" w:hAnsi="Arial"/>
+                <w:b/>
+                <w:bCs/>
+                <w:sz w:val="18"/>
+                <w:szCs w:val="18"/>
+              </w:rPr>
+              <w:t xml:space="preserve">Cross ACC</w:t>
+            </w:r>
+          </w:p>
+        </w:tc>
+        <w:tc>
+          <w:tcPr>
+            <w:tcW w:type="dxa" w:w="2000"/>
+            <w:tcBorders>
+              <w:top w:val="single" w:color="CCCCCC" w:sz="1"/>
+              <w:left w:val="single" w:color="CCCCCC" w:sz="1"/>
+              <w:bottom w:val="single" w:color="CCCCCC" w:sz="1"/>
+              <w:right w:val="single" w:color="CCCCCC" w:sz="1"/>
+            </w:tcBorders>
+            <w:shd w:fill="D5E8F0" w:val="clear"/>
+            <w:tcMar>
+              <w:top w:type="dxa" w:w="60"/>
+              <w:left w:type="dxa" w:w="110"/>
+              <w:bottom w:type="dxa" w:w="60"/>
+              <w:right w:type="dxa" w:w="110"/>
+            </w:tcMar>
+          </w:tcPr>
+          <w:p>
+            <w:r>
+              <w:rPr>
+                <w:rFonts w:ascii="Arial" w:cs="Arial" w:eastAsia="Arial" w:hAnsi="Arial"/>
+                <w:b/>
+                <w:bCs/>
+                <w:sz w:val="18"/>
+                <w:szCs w:val="18"/>
+              </w:rPr>
+              <w:t xml:space="preserve">Cross AUC</w:t>
+            </w:r>
+          </w:p>
+        </w:tc>
+        <w:tc>
+          <w:tcPr>
+            <w:tcW w:type="dxa" w:w="1960"/>
+            <w:tcBorders>
+              <w:top w:val="single" w:color="CCCCCC" w:sz="1"/>
+              <w:left w:val="single" w:color="CCCCCC" w:sz="1"/>
+              <w:bottom w:val="single" w:color="CCCCCC" w:sz="1"/>
+              <w:right w:val="single" w:color="CCCCCC" w:sz="1"/>
+            </w:tcBorders>
+            <w:shd w:fill="D5E8F0" w:val="clear"/>
+            <w:tcMar>
+              <w:top w:type="dxa" w:w="60"/>
+              <w:left w:type="dxa" w:w="110"/>
+              <w:bottom w:type="dxa" w:w="60"/>
+              <w:right w:type="dxa" w:w="110"/>
+            </w:tcMar>
+          </w:tcPr>
+          <w:p>
+            <w:r>
+              <w:rPr>
+                <w:rFonts w:ascii="Arial" w:cs="Arial" w:eastAsia="Arial" w:hAnsi="Arial"/>
+                <w:b/>
+                <w:bCs/>
+                <w:sz w:val="18"/>
+                <w:szCs w:val="18"/>
+              </w:rPr>
+              <w:t xml:space="preserve">Cross EER</w:t>
+            </w:r>
+          </w:p>
+        </w:tc>
+      </w:tr>
+      <w:tr>
+        <w:tc>
+          <w:tcPr>
+            <w:tcW w:type="dxa" w:w="1400"/>
+            <w:tcBorders>
+              <w:top w:val="single" w:color="CCCCCC" w:sz="1"/>
+              <w:left w:val="single" w:color="CCCCCC" w:sz="1"/>
+              <w:bottom w:val="single" w:color="CCCCCC" w:sz="1"/>
+              <w:right w:val="single" w:color="CCCCCC" w:sz="1"/>
+            </w:tcBorders>
+            <w:tcMar>
+              <w:top w:type="dxa" w:w="60"/>
+              <w:left w:type="dxa" w:w="110"/>
+              <w:bottom w:type="dxa" w:w="60"/>
+              <w:right w:type="dxa" w:w="110"/>
+            </w:tcMar>
+          </w:tcPr>
+          <w:p>
+            <w:r>
+              <w:rPr>
+                <w:rFonts w:ascii="Arial" w:cs="Arial" w:eastAsia="Arial" w:hAnsi="Arial"/>
+                <w:sz w:val="18"/>
+                <w:szCs w:val="18"/>
+              </w:rPr>
+              <w:t xml:space="preserve">Run 1</w:t>
+            </w:r>
+          </w:p>
+        </w:tc>
+        <w:tc>
+          <w:tcPr>
+            <w:tcW w:type="dxa" w:w="2000"/>
+            <w:tcBorders>
+              <w:top w:val="single" w:color="CCCCCC" w:sz="1"/>
+              <w:left w:val="single" w:color="CCCCCC" w:sz="1"/>
+              <w:bottom w:val="single" w:color="CCCCCC" w:sz="1"/>
+              <w:right w:val="single" w:color="CCCCCC" w:sz="1"/>
+            </w:tcBorders>
+            <w:tcMar>
+              <w:top w:type="dxa" w:w="60"/>
+              <w:left w:type="dxa" w:w="110"/>
+              <w:bottom w:type="dxa" w:w="60"/>
+              <w:right w:type="dxa" w:w="110"/>
+            </w:tcMar>
+          </w:tcPr>
+          <w:p>
+            <w:r>
+              <w:rPr>
+                <w:rFonts w:ascii="Arial" w:cs="Arial" w:eastAsia="Arial" w:hAnsi="Arial"/>
+                <w:sz w:val="18"/>
+                <w:szCs w:val="18"/>
+              </w:rPr>
+              <w:t xml:space="preserve">99.94%</w:t>
+            </w:r>
+          </w:p>
+        </w:tc>
+        <w:tc>
+          <w:tcPr>
+            <w:tcW w:type="dxa" w:w="2000"/>
+            <w:tcBorders>
+              <w:top w:val="single" w:color="CCCCCC" w:sz="1"/>
+              <w:left w:val="single" w:color="CCCCCC" w:sz="1"/>
+              <w:bottom w:val="single" w:color="CCCCCC" w:sz="1"/>
+              <w:right w:val="single" w:color="CCCCCC" w:sz="1"/>
+            </w:tcBorders>
+            <w:tcMar>
+              <w:top w:type="dxa" w:w="60"/>
+              <w:left w:type="dxa" w:w="110"/>
+              <w:bottom w:type="dxa" w:w="60"/>
+              <w:right w:type="dxa" w:w="110"/>
+            </w:tcMar>
+          </w:tcPr>
+          <w:p>
+            <w:r>
+              <w:rPr>
+                <w:rFonts w:ascii="Arial" w:cs="Arial" w:eastAsia="Arial" w:hAnsi="Arial"/>
+                <w:sz w:val="18"/>
+                <w:szCs w:val="18"/>
+              </w:rPr>
+              <w:t xml:space="preserve">96.48%</w:t>
+            </w:r>
+          </w:p>
+        </w:tc>
+        <w:tc>
+          <w:tcPr>
+            <w:tcW w:type="dxa" w:w="2000"/>
+            <w:tcBorders>
+              <w:top w:val="single" w:color="CCCCCC" w:sz="1"/>
+              <w:left w:val="single" w:color="CCCCCC" w:sz="1"/>
+              <w:bottom w:val="single" w:color="CCCCCC" w:sz="1"/>
+              <w:right w:val="single" w:color="CCCCCC" w:sz="1"/>
+            </w:tcBorders>
+            <w:tcMar>
+              <w:top w:type="dxa" w:w="60"/>
+              <w:left w:type="dxa" w:w="110"/>
+              <w:bottom w:type="dxa" w:w="60"/>
+              <w:right w:type="dxa" w:w="110"/>
+            </w:tcMar>
+          </w:tcPr>
+          <w:p>
+            <w:r>
+              <w:rPr>
+                <w:rFonts w:ascii="Arial" w:cs="Arial" w:eastAsia="Arial" w:hAnsi="Arial"/>
+                <w:sz w:val="18"/>
+                <w:szCs w:val="18"/>
+              </w:rPr>
+              <w:t xml:space="preserve">99.99%</w:t>
+            </w:r>
+          </w:p>
+        </w:tc>
+        <w:tc>
+          <w:tcPr>
+            <w:tcW w:type="dxa" w:w="1960"/>
+            <w:tcBorders>
+              <w:top w:val="single" w:color="CCCCCC" w:sz="1"/>
+              <w:left w:val="single" w:color="CCCCCC" w:sz="1"/>
+              <w:bottom w:val="single" w:color="CCCCCC" w:sz="1"/>
+              <w:right w:val="single" w:color="CCCCCC" w:sz="1"/>
+            </w:tcBorders>
+            <w:tcMar>
+              <w:top w:type="dxa" w:w="60"/>
+              <w:left w:type="dxa" w:w="110"/>
+              <w:bottom w:type="dxa" w:w="60"/>
+              <w:right w:type="dxa" w:w="110"/>
+            </w:tcMar>
+          </w:tcPr>
+          <w:p>
+            <w:r>
+              <w:rPr>
+                <w:rFonts w:ascii="Arial" w:cs="Arial" w:eastAsia="Arial" w:hAnsi="Arial"/>
+                <w:sz w:val="18"/>
+                <w:szCs w:val="18"/>
+              </w:rPr>
+              <w:t xml:space="preserve">0.52%</w:t>
+            </w:r>
+          </w:p>
+        </w:tc>
+      </w:tr>
+      <w:tr>
+        <w:tc>
+          <w:tcPr>
+            <w:tcW w:type="dxa" w:w="1400"/>
+            <w:tcBorders>
+              <w:top w:val="single" w:color="CCCCCC" w:sz="1"/>
+              <w:left w:val="single" w:color="CCCCCC" w:sz="1"/>
+              <w:bottom w:val="single" w:color="CCCCCC" w:sz="1"/>
+              <w:right w:val="single" w:color="CCCCCC" w:sz="1"/>
+            </w:tcBorders>
+            <w:tcMar>
+              <w:top w:type="dxa" w:w="60"/>
+              <w:left w:type="dxa" w:w="110"/>
+              <w:bottom w:type="dxa" w:w="60"/>
+              <w:right w:type="dxa" w:w="110"/>
+            </w:tcMar>
+          </w:tcPr>
+          <w:p>
+            <w:r>
+              <w:rPr>
+                <w:rFonts w:ascii="Arial" w:cs="Arial" w:eastAsia="Arial" w:hAnsi="Arial"/>
+                <w:sz w:val="18"/>
+                <w:szCs w:val="18"/>
+              </w:rPr>
+              <w:t xml:space="preserve">Run 2</w:t>
+            </w:r>
+          </w:p>
+        </w:tc>
+        <w:tc>
+          <w:tcPr>
+            <w:tcW w:type="dxa" w:w="2000"/>
+            <w:tcBorders>
+              <w:top w:val="single" w:color="CCCCCC" w:sz="1"/>
+              <w:left w:val="single" w:color="CCCCCC" w:sz="1"/>
+              <w:bottom w:val="single" w:color="CCCCCC" w:sz="1"/>
+              <w:right w:val="single" w:color="CCCCCC" w:sz="1"/>
+            </w:tcBorders>
+            <w:tcMar>
+              <w:top w:type="dxa" w:w="60"/>
+              <w:left w:type="dxa" w:w="110"/>
+              <w:bottom w:type="dxa" w:w="60"/>
+              <w:right w:type="dxa" w:w="110"/>
+            </w:tcMar>
+          </w:tcPr>
+          <w:p>
+            <w:r>
+              <w:rPr>
+                <w:rFonts w:ascii="Arial" w:cs="Arial" w:eastAsia="Arial" w:hAnsi="Arial"/>
+                <w:sz w:val="18"/>
+                <w:szCs w:val="18"/>
+              </w:rPr>
+              <w:t xml:space="preserve">100.0%</w:t>
+            </w:r>
+          </w:p>
+        </w:tc>
+        <w:tc>
+          <w:tcPr>
+            <w:tcW w:type="dxa" w:w="2000"/>
+            <w:tcBorders>
+              <w:top w:val="single" w:color="CCCCCC" w:sz="1"/>
+              <w:left w:val="single" w:color="CCCCCC" w:sz="1"/>
+              <w:bottom w:val="single" w:color="CCCCCC" w:sz="1"/>
+              <w:right w:val="single" w:color="CCCCCC" w:sz="1"/>
+            </w:tcBorders>
+            <w:tcMar>
+              <w:top w:type="dxa" w:w="60"/>
+              <w:left w:type="dxa" w:w="110"/>
+              <w:bottom w:type="dxa" w:w="60"/>
+              <w:right w:type="dxa" w:w="110"/>
+            </w:tcMar>
+          </w:tcPr>
+          <w:p>
+            <w:r>
+              <w:rPr>
+                <w:rFonts w:ascii="Arial" w:cs="Arial" w:eastAsia="Arial" w:hAnsi="Arial"/>
+                <w:sz w:val="18"/>
+                <w:szCs w:val="18"/>
+              </w:rPr>
+              <w:t xml:space="preserve">96.52%</w:t>
+            </w:r>
+          </w:p>
+        </w:tc>
+        <w:tc>
+          <w:tcPr>
+            <w:tcW w:type="dxa" w:w="2000"/>
+            <w:tcBorders>
+              <w:top w:val="single" w:color="CCCCCC" w:sz="1"/>
+              <w:left w:val="single" w:color="CCCCCC" w:sz="1"/>
+              <w:bottom w:val="single" w:color="CCCCCC" w:sz="1"/>
+              <w:right w:val="single" w:color="CCCCCC" w:sz="1"/>
+            </w:tcBorders>
+            <w:tcMar>
+              <w:top w:type="dxa" w:w="60"/>
+              <w:left w:type="dxa" w:w="110"/>
+              <w:bottom w:type="dxa" w:w="60"/>
+              <w:right w:type="dxa" w:w="110"/>
+            </w:tcMar>
+          </w:tcPr>
+          <w:p>
+            <w:r>
+              <w:rPr>
+                <w:rFonts w:ascii="Arial" w:cs="Arial" w:eastAsia="Arial" w:hAnsi="Arial"/>
+                <w:sz w:val="18"/>
+                <w:szCs w:val="18"/>
+              </w:rPr>
+              <w:t xml:space="preserve">99.89%</w:t>
+            </w:r>
+          </w:p>
+        </w:tc>
+        <w:tc>
+          <w:tcPr>
+            <w:tcW w:type="dxa" w:w="1960"/>
+            <w:tcBorders>
+              <w:top w:val="single" w:color="CCCCCC" w:sz="1"/>
+              <w:left w:val="single" w:color="CCCCCC" w:sz="1"/>
+              <w:bottom w:val="single" w:color="CCCCCC" w:sz="1"/>
+              <w:right w:val="single" w:color="CCCCCC" w:sz="1"/>
+            </w:tcBorders>
+            <w:tcMar>
+              <w:top w:type="dxa" w:w="60"/>
+              <w:left w:type="dxa" w:w="110"/>
+              <w:bottom w:type="dxa" w:w="60"/>
+              <w:right w:type="dxa" w:w="110"/>
+            </w:tcMar>
+          </w:tcPr>
+          <w:p>
+            <w:r>
+              <w:rPr>
+                <w:rFonts w:ascii="Arial" w:cs="Arial" w:eastAsia="Arial" w:hAnsi="Arial"/>
+                <w:sz w:val="18"/>
+                <w:szCs w:val="18"/>
+              </w:rPr>
+              <w:t xml:space="preserve">1.81%</w:t>
+            </w:r>
+          </w:p>
+        </w:tc>
+      </w:tr>
+      <w:tr>
+        <w:tc>
+          <w:tcPr>
+            <w:tcW w:type="dxa" w:w="1400"/>
+            <w:tcBorders>
+              <w:top w:val="single" w:color="CCCCCC" w:sz="1"/>
+              <w:left w:val="single" w:color="CCCCCC" w:sz="1"/>
+              <w:bottom w:val="single" w:color="CCCCCC" w:sz="1"/>
+              <w:right w:val="single" w:color="CCCCCC" w:sz="1"/>
+            </w:tcBorders>
+            <w:tcMar>
+              <w:top w:type="dxa" w:w="60"/>
+              <w:left w:type="dxa" w:w="110"/>
+              <w:bottom w:type="dxa" w:w="60"/>
+              <w:right w:type="dxa" w:w="110"/>
+            </w:tcMar>
+          </w:tcPr>
+          <w:p>
+            <w:r>
+              <w:rPr>
+                <w:rFonts w:ascii="Arial" w:cs="Arial" w:eastAsia="Arial" w:hAnsi="Arial"/>
+                <w:sz w:val="18"/>
+                <w:szCs w:val="18"/>
+              </w:rPr>
+              <w:t xml:space="preserve">Run 3</w:t>
+            </w:r>
+          </w:p>
+        </w:tc>
+        <w:tc>
+          <w:tcPr>
+            <w:tcW w:type="dxa" w:w="2000"/>
+            <w:tcBorders>
+              <w:top w:val="single" w:color="CCCCCC" w:sz="1"/>
+              <w:left w:val="single" w:color="CCCCCC" w:sz="1"/>
+              <w:bottom w:val="single" w:color="CCCCCC" w:sz="1"/>
+              <w:right w:val="single" w:color="CCCCCC" w:sz="1"/>
+            </w:tcBorders>
+            <w:tcMar>
+              <w:top w:type="dxa" w:w="60"/>
+              <w:left w:type="dxa" w:w="110"/>
+              <w:bottom w:type="dxa" w:w="60"/>
+              <w:right w:type="dxa" w:w="110"/>
+            </w:tcMar>
+          </w:tcPr>
+          <w:p>
+            <w:r>
+              <w:rPr>
+                <w:rFonts w:ascii="Arial" w:cs="Arial" w:eastAsia="Arial" w:hAnsi="Arial"/>
+                <w:sz w:val="18"/>
+                <w:szCs w:val="18"/>
+              </w:rPr>
+              <w:t xml:space="preserve">100.0%</w:t>
+            </w:r>
+          </w:p>
+        </w:tc>
+        <w:tc>
+          <w:tcPr>
+            <w:tcW w:type="dxa" w:w="2000"/>
+            <w:tcBorders>
+              <w:top w:val="single" w:color="CCCCCC" w:sz="1"/>
+              <w:left w:val="single" w:color="CCCCCC" w:sz="1"/>
+              <w:bottom w:val="single" w:color="CCCCCC" w:sz="1"/>
+              <w:right w:val="single" w:color="CCCCCC" w:sz="1"/>
+            </w:tcBorders>
+            <w:tcMar>
+              <w:top w:type="dxa" w:w="60"/>
+              <w:left w:type="dxa" w:w="110"/>
+              <w:bottom w:type="dxa" w:w="60"/>
+              <w:right w:type="dxa" w:w="110"/>
+            </w:tcMar>
+          </w:tcPr>
+          <w:p>
+            <w:r>
+              <w:rPr>
+                <w:rFonts w:ascii="Arial" w:cs="Arial" w:eastAsia="Arial" w:hAnsi="Arial"/>
+                <w:sz w:val="18"/>
+                <w:szCs w:val="18"/>
+              </w:rPr>
+              <w:t xml:space="preserve">98.29%</w:t>
+            </w:r>
+          </w:p>
+        </w:tc>
+        <w:tc>
+          <w:tcPr>
+            <w:tcW w:type="dxa" w:w="2000"/>
+            <w:tcBorders>
+              <w:top w:val="single" w:color="CCCCCC" w:sz="1"/>
+              <w:left w:val="single" w:color="CCCCCC" w:sz="1"/>
+              <w:bottom w:val="single" w:color="CCCCCC" w:sz="1"/>
+              <w:right w:val="single" w:color="CCCCCC" w:sz="1"/>
+            </w:tcBorders>
+            <w:tcMar>
+              <w:top w:type="dxa" w:w="60"/>
+              <w:left w:type="dxa" w:w="110"/>
+              <w:bottom w:type="dxa" w:w="60"/>
+              <w:right w:type="dxa" w:w="110"/>
+            </w:tcMar>
+          </w:tcPr>
+          <w:p>
+            <w:r>
+              <w:rPr>
+                <w:rFonts w:ascii="Arial" w:cs="Arial" w:eastAsia="Arial" w:hAnsi="Arial"/>
+                <w:sz w:val="18"/>
+                <w:szCs w:val="18"/>
+              </w:rPr>
+              <w:t xml:space="preserve">99.90%</w:t>
+            </w:r>
+          </w:p>
+        </w:tc>
+        <w:tc>
+          <w:tcPr>
+            <w:tcW w:type="dxa" w:w="1960"/>
+            <w:tcBorders>
+              <w:top w:val="single" w:color="CCCCCC" w:sz="1"/>
+              <w:left w:val="single" w:color="CCCCCC" w:sz="1"/>
+              <w:bottom w:val="single" w:color="CCCCCC" w:sz="1"/>
+              <w:right w:val="single" w:color="CCCCCC" w:sz="1"/>
+            </w:tcBorders>
+            <w:tcMar>
+              <w:top w:type="dxa" w:w="60"/>
+              <w:left w:type="dxa" w:w="110"/>
+              <w:bottom w:type="dxa" w:w="60"/>
+              <w:right w:type="dxa" w:w="110"/>
+            </w:tcMar>
+          </w:tcPr>
+          <w:p>
+            <w:r>
+              <w:rPr>
+                <w:rFonts w:ascii="Arial" w:cs="Arial" w:eastAsia="Arial" w:hAnsi="Arial"/>
+                <w:sz w:val="18"/>
+                <w:szCs w:val="18"/>
+              </w:rPr>
+              <w:t xml:space="preserve">1.55%</w:t>
+            </w:r>
+          </w:p>
+        </w:tc>
+      </w:tr>
+      <w:tr>
+        <w:tc>
+          <w:tcPr>
+            <w:tcW w:type="dxa" w:w="1400"/>
+            <w:tcBorders>
+              <w:top w:val="single" w:color="CCCCCC" w:sz="1"/>
+              <w:left w:val="single" w:color="CCCCCC" w:sz="1"/>
+              <w:bottom w:val="single" w:color="CCCCCC" w:sz="1"/>
+              <w:right w:val="single" w:color="CCCCCC" w:sz="1"/>
+            </w:tcBorders>
+            <w:shd w:fill="D5E8F0" w:val="clear"/>
+            <w:tcMar>
+              <w:top w:type="dxa" w:w="60"/>
+              <w:left w:type="dxa" w:w="110"/>
+              <w:bottom w:type="dxa" w:w="60"/>
+              <w:right w:type="dxa" w:w="110"/>
+            </w:tcMar>
+          </w:tcPr>
+          <w:p>
+            <w:r>
+              <w:rPr>
+                <w:rFonts w:ascii="Arial" w:cs="Arial" w:eastAsia="Arial" w:hAnsi="Arial"/>
+                <w:b/>
+                <w:bCs/>
+                <w:sz w:val="18"/>
+                <w:szCs w:val="18"/>
+              </w:rPr>
+              <w:t xml:space="preserve">Mean ± SD</w:t>
+            </w:r>
+          </w:p>
+        </w:tc>
+        <w:tc>
+          <w:tcPr>
+            <w:tcW w:type="dxa" w:w="2000"/>
+            <w:tcBorders>
+              <w:top w:val="single" w:color="CCCCCC" w:sz="1"/>
+              <w:left w:val="single" w:color="CCCCCC" w:sz="1"/>
+              <w:bottom w:val="single" w:color="CCCCCC" w:sz="1"/>
+              <w:right w:val="single" w:color="CCCCCC" w:sz="1"/>
+            </w:tcBorders>
+            <w:shd w:fill="D5E8F0" w:val="clear"/>
+            <w:tcMar>
+              <w:top w:type="dxa" w:w="60"/>
+              <w:left w:type="dxa" w:w="110"/>
+              <w:bottom w:type="dxa" w:w="60"/>
+              <w:right w:type="dxa" w:w="110"/>
+            </w:tcMar>
+          </w:tcPr>
+          <w:p>
+            <w:r>
+              <w:rPr>
+                <w:rFonts w:ascii="Arial" w:cs="Arial" w:eastAsia="Arial" w:hAnsi="Arial"/>
+                <w:b/>
+                <w:bCs/>
+                <w:sz w:val="18"/>
+                <w:szCs w:val="18"/>
+              </w:rPr>
+              <w:t xml:space="preserve">99.98 ± 0.04</w:t>
+            </w:r>
+          </w:p>
+        </w:tc>
+        <w:tc>
+          <w:tcPr>
+            <w:tcW w:type="dxa" w:w="2000"/>
+            <w:tcBorders>
+              <w:top w:val="single" w:color="CCCCCC" w:sz="1"/>
+              <w:left w:val="single" w:color="CCCCCC" w:sz="1"/>
+              <w:bottom w:val="single" w:color="CCCCCC" w:sz="1"/>
+              <w:right w:val="single" w:color="CCCCCC" w:sz="1"/>
+            </w:tcBorders>
+            <w:shd w:fill="D5E8F0" w:val="clear"/>
+            <w:tcMar>
+              <w:top w:type="dxa" w:w="60"/>
+              <w:left w:type="dxa" w:w="110"/>
+              <w:bottom w:type="dxa" w:w="60"/>
+              <w:right w:type="dxa" w:w="110"/>
+            </w:tcMar>
+          </w:tcPr>
+          <w:p>
+            <w:r>
+              <w:rPr>
+                <w:rFonts w:ascii="Arial" w:cs="Arial" w:eastAsia="Arial" w:hAnsi="Arial"/>
+                <w:b/>
+                <w:bCs/>
+                <w:sz w:val="18"/>
+                <w:szCs w:val="18"/>
+              </w:rPr>
+              <w:t xml:space="preserve">97.10 ± 1.03</w:t>
+            </w:r>
+          </w:p>
+        </w:tc>
+        <w:tc>
+          <w:tcPr>
+            <w:tcW w:type="dxa" w:w="2000"/>
+            <w:tcBorders>
+              <w:top w:val="single" w:color="CCCCCC" w:sz="1"/>
+              <w:left w:val="single" w:color="CCCCCC" w:sz="1"/>
+              <w:bottom w:val="single" w:color="CCCCCC" w:sz="1"/>
+              <w:right w:val="single" w:color="CCCCCC" w:sz="1"/>
+            </w:tcBorders>
+            <w:shd w:fill="D5E8F0" w:val="clear"/>
+            <w:tcMar>
+              <w:top w:type="dxa" w:w="60"/>
+              <w:left w:type="dxa" w:w="110"/>
+              <w:bottom w:type="dxa" w:w="60"/>
+              <w:right w:type="dxa" w:w="110"/>
+            </w:tcMar>
+          </w:tcPr>
+          <w:p>
+            <w:r>
+              <w:rPr>
+                <w:rFonts w:ascii="Arial" w:cs="Arial" w:eastAsia="Arial" w:hAnsi="Arial"/>
+                <w:b/>
+                <w:bCs/>
+                <w:sz w:val="18"/>
+                <w:szCs w:val="18"/>
+              </w:rPr>
+              <w:t xml:space="preserve">99.93 ± 0.05</w:t>
+            </w:r>
+          </w:p>
+        </w:tc>
+        <w:tc>
+          <w:tcPr>
+            <w:tcW w:type="dxa" w:w="1960"/>
+            <w:tcBorders>
+              <w:top w:val="single" w:color="CCCCCC" w:sz="1"/>
+              <w:left w:val="single" w:color="CCCCCC" w:sz="1"/>
+              <w:bottom w:val="single" w:color="CCCCCC" w:sz="1"/>
+              <w:right w:val="single" w:color="CCCCCC" w:sz="1"/>
+            </w:tcBorders>
+            <w:shd w:fill="D5E8F0" w:val="clear"/>
+            <w:tcMar>
+              <w:top w:type="dxa" w:w="60"/>
+              <w:left w:type="dxa" w:w="110"/>
+              <w:bottom w:type="dxa" w:w="60"/>
+              <w:right w:type="dxa" w:w="110"/>
+            </w:tcMar>
+          </w:tcPr>
+          <w:p>
+            <w:r>
+              <w:rPr>
+                <w:rFonts w:ascii="Arial" w:cs="Arial" w:eastAsia="Arial" w:hAnsi="Arial"/>
+                <w:b/>
+                <w:bCs/>
+                <w:sz w:val="18"/>
+                <w:szCs w:val="18"/>
+              </w:rPr>
+              <w:t xml:space="preserve">1.29 ± 0.68</w:t>
+            </w:r>
+          </w:p>
+        </w:tc>
+      </w:tr>
+    </w:tbl>
+    <w:p>
+      <w:pPr>
+        <w:spacing w:after="120" w:before="0"/>
+      </w:pPr>
+      <w:r>
+        <w:rPr>
+          <w:sz w:val="21"/>
+          <w:szCs w:val="21"/>
+        </w:rPr>
+        <w:t xml:space="preserve">(In-domain AUC = 100.0 ± 0.0, in-domain EER = 0.02 ± 0.04.) Best in-domain epochs selected for the cross-domain test: 13, 8, 6.</w:t>
+      </w:r>
+    </w:p>
+    <w:p>
+      <w:pPr>
+        <w:pStyle w:val="Heading2"/>
+      </w:pPr>
+      <w:r>
+        <w:t xml:space="preserve">6.5 Comparison with the paper (Table 3, German / ResNet-50)</w:t>
+      </w:r>
+    </w:p>
+    <w:tbl>
+      <w:tblPr>
+        <w:tblW w:type="dxa" w:w="9360"/>
+        <w:tblBorders>
+          <w:top w:val="single" w:color="auto" w:sz="4"/>
+          <w:left w:val="single" w:color="auto" w:sz="4"/>
+          <w:bottom w:val="single" w:color="auto" w:sz="4"/>
+          <w:right w:val="single" w:color="auto" w:sz="4"/>
+          <w:insideH w:val="single" w:color="auto" w:sz="4"/>
+          <w:insideV w:val="single" w:color="auto" w:sz="4"/>
+        </w:tblBorders>
+      </w:tblPr>
+      <w:tblGrid>
+        <w:gridCol w:w="3120"/>
+        <w:gridCol w:w="3120"/>
+        <w:gridCol w:w="3120"/>
+      </w:tblGrid>
+      <w:tr>
+        <w:trPr>
+          <w:tblHeader/>
+        </w:trPr>
+        <w:tc>
+          <w:tcPr>
+            <w:tcW w:type="dxa" w:w="3120"/>
+            <w:tcBorders>
+              <w:top w:val="single" w:color="CCCCCC" w:sz="1"/>
+              <w:left w:val="single" w:color="CCCCCC" w:sz="1"/>
+              <w:bottom w:val="single" w:color="CCCCCC" w:sz="1"/>
+              <w:right w:val="single" w:color="CCCCCC" w:sz="1"/>
+            </w:tcBorders>
+            <w:shd w:fill="D5E8F0" w:val="clear"/>
+            <w:tcMar>
+              <w:top w:type="dxa" w:w="60"/>
+              <w:left w:type="dxa" w:w="110"/>
+              <w:bottom w:type="dxa" w:w="60"/>
+              <w:right w:type="dxa" w:w="110"/>
+            </w:tcMar>
+          </w:tcPr>
+          <w:p>
+            <w:r>
+              <w:rPr>
+                <w:rFonts w:ascii="Arial" w:cs="Arial" w:eastAsia="Arial" w:hAnsi="Arial"/>
+                <w:b/>
+                <w:bCs/>
+                <w:sz w:val="18"/>
+                <w:szCs w:val="18"/>
+              </w:rPr>
+              <w:t xml:space="preserve">Metric</w:t>
+            </w:r>
+          </w:p>
+        </w:tc>
+        <w:tc>
+          <w:tcPr>
+            <w:tcW w:type="dxa" w:w="3120"/>
+            <w:tcBorders>
+              <w:top w:val="single" w:color="CCCCCC" w:sz="1"/>
+              <w:left w:val="single" w:color="CCCCCC" w:sz="1"/>
+              <w:bottom w:val="single" w:color="CCCCCC" w:sz="1"/>
+              <w:right w:val="single" w:color="CCCCCC" w:sz="1"/>
+            </w:tcBorders>
+            <w:shd w:fill="D5E8F0" w:val="clear"/>
+            <w:tcMar>
+              <w:top w:type="dxa" w:w="60"/>
+              <w:left w:type="dxa" w:w="110"/>
+              <w:bottom w:type="dxa" w:w="60"/>
+              <w:right w:type="dxa" w:w="110"/>
+            </w:tcMar>
+          </w:tcPr>
+          <w:p>
+            <w:r>
+              <w:rPr>
+                <w:rFonts w:ascii="Arial" w:cs="Arial" w:eastAsia="Arial" w:hAnsi="Arial"/>
+                <w:b/>
+                <w:bCs/>
+                <w:sz w:val="18"/>
+                <w:szCs w:val="18"/>
+              </w:rPr>
+              <w:t xml:space="preserve">Paper (reported)</w:t>
+            </w:r>
+          </w:p>
+        </w:tc>
+        <w:tc>
+          <w:tcPr>
+            <w:tcW w:type="dxa" w:w="3120"/>
+            <w:tcBorders>
+              <w:top w:val="single" w:color="CCCCCC" w:sz="1"/>
+              <w:left w:val="single" w:color="CCCCCC" w:sz="1"/>
+              <w:bottom w:val="single" w:color="CCCCCC" w:sz="1"/>
+              <w:right w:val="single" w:color="CCCCCC" w:sz="1"/>
+            </w:tcBorders>
+            <w:shd w:fill="D5E8F0" w:val="clear"/>
+            <w:tcMar>
+              <w:top w:type="dxa" w:w="60"/>
+              <w:left w:type="dxa" w:w="110"/>
+              <w:bottom w:type="dxa" w:w="60"/>
+              <w:right w:type="dxa" w:w="110"/>
+            </w:tcMar>
+          </w:tcPr>
+          <w:p>
+            <w:r>
+              <w:rPr>
+                <w:rFonts w:ascii="Arial" w:cs="Arial" w:eastAsia="Arial" w:hAnsi="Arial"/>
+                <w:b/>
+                <w:bCs/>
+                <w:sz w:val="18"/>
+                <w:szCs w:val="18"/>
+              </w:rPr>
+              <w:t xml:space="preserve">This reproduction</w:t>
+            </w:r>
+          </w:p>
+        </w:tc>
+      </w:tr>
+      <w:tr>
+        <w:tc>
+          <w:tcPr>
+            <w:tcW w:type="dxa" w:w="3120"/>
+            <w:tcBorders>
+              <w:top w:val="single" w:color="CCCCCC" w:sz="1"/>
+              <w:left w:val="single" w:color="CCCCCC" w:sz="1"/>
+              <w:bottom w:val="single" w:color="CCCCCC" w:sz="1"/>
+              <w:right w:val="single" w:color="CCCCCC" w:sz="1"/>
+            </w:tcBorders>
+            <w:tcMar>
+              <w:top w:type="dxa" w:w="60"/>
+              <w:left w:type="dxa" w:w="110"/>
+              <w:bottom w:type="dxa" w:w="60"/>
+              <w:right w:type="dxa" w:w="110"/>
+            </w:tcMar>
+          </w:tcPr>
+          <w:p>
+            <w:r>
+              <w:rPr>
+                <w:rFonts w:ascii="Arial" w:cs="Arial" w:eastAsia="Arial" w:hAnsi="Arial"/>
+                <w:sz w:val="18"/>
+                <w:szCs w:val="18"/>
+              </w:rPr>
+              <w:t xml:space="preserve">In-domain ACC</w:t>
+            </w:r>
+          </w:p>
+        </w:tc>
+        <w:tc>
+          <w:tcPr>
+            <w:tcW w:type="dxa" w:w="3120"/>
+            <w:tcBorders>
+              <w:top w:val="single" w:color="CCCCCC" w:sz="1"/>
+              <w:left w:val="single" w:color="CCCCCC" w:sz="1"/>
+              <w:bottom w:val="single" w:color="CCCCCC" w:sz="1"/>
+              <w:right w:val="single" w:color="CCCCCC" w:sz="1"/>
+            </w:tcBorders>
+            <w:tcMar>
+              <w:top w:type="dxa" w:w="60"/>
+              <w:left w:type="dxa" w:w="110"/>
+              <w:bottom w:type="dxa" w:w="60"/>
+              <w:right w:type="dxa" w:w="110"/>
+            </w:tcMar>
+          </w:tcPr>
+          <w:p>
+            <w:r>
+              <w:rPr>
+                <w:rFonts w:ascii="Arial" w:cs="Arial" w:eastAsia="Arial" w:hAnsi="Arial"/>
+                <w:sz w:val="18"/>
+                <w:szCs w:val="18"/>
+              </w:rPr>
+              <w:t xml:space="preserve">100%</w:t>
+            </w:r>
+          </w:p>
+        </w:tc>
+        <w:tc>
+          <w:tcPr>
+            <w:tcW w:type="dxa" w:w="3120"/>
+            <w:tcBorders>
+              <w:top w:val="single" w:color="CCCCCC" w:sz="1"/>
+              <w:left w:val="single" w:color="CCCCCC" w:sz="1"/>
+              <w:bottom w:val="single" w:color="CCCCCC" w:sz="1"/>
+              <w:right w:val="single" w:color="CCCCCC" w:sz="1"/>
+            </w:tcBorders>
+            <w:tcMar>
+              <w:top w:type="dxa" w:w="60"/>
+              <w:left w:type="dxa" w:w="110"/>
+              <w:bottom w:type="dxa" w:w="60"/>
+              <w:right w:type="dxa" w:w="110"/>
+            </w:tcMar>
+          </w:tcPr>
+          <w:p>
+            <w:r>
+              <w:rPr>
+                <w:rFonts w:ascii="Arial" w:cs="Arial" w:eastAsia="Arial" w:hAnsi="Arial"/>
+                <w:sz w:val="18"/>
+                <w:szCs w:val="18"/>
+              </w:rPr>
+              <w:t xml:space="preserve">99.98% ± 0.04</w:t>
+            </w:r>
+          </w:p>
+        </w:tc>
+      </w:tr>
+      <w:tr>
+        <w:tc>
+          <w:tcPr>
+            <w:tcW w:type="dxa" w:w="3120"/>
+            <w:tcBorders>
+              <w:top w:val="single" w:color="CCCCCC" w:sz="1"/>
+              <w:left w:val="single" w:color="CCCCCC" w:sz="1"/>
+              <w:bottom w:val="single" w:color="CCCCCC" w:sz="1"/>
+              <w:right w:val="single" w:color="CCCCCC" w:sz="1"/>
+            </w:tcBorders>
+            <w:tcMar>
+              <w:top w:type="dxa" w:w="60"/>
+              <w:left w:type="dxa" w:w="110"/>
+              <w:bottom w:type="dxa" w:w="60"/>
+              <w:right w:type="dxa" w:w="110"/>
+            </w:tcMar>
+          </w:tcPr>
+          <w:p>
+            <w:r>
+              <w:rPr>
+                <w:rFonts w:ascii="Arial" w:cs="Arial" w:eastAsia="Arial" w:hAnsi="Arial"/>
+                <w:sz w:val="18"/>
+                <w:szCs w:val="18"/>
+              </w:rPr>
+              <w:t xml:space="preserve">Cross-domain ACC</w:t>
+            </w:r>
+          </w:p>
+        </w:tc>
+        <w:tc>
+          <w:tcPr>
+            <w:tcW w:type="dxa" w:w="3120"/>
+            <w:tcBorders>
+              <w:top w:val="single" w:color="CCCCCC" w:sz="1"/>
+              <w:left w:val="single" w:color="CCCCCC" w:sz="1"/>
+              <w:bottom w:val="single" w:color="CCCCCC" w:sz="1"/>
+              <w:right w:val="single" w:color="CCCCCC" w:sz="1"/>
+            </w:tcBorders>
+            <w:tcMar>
+              <w:top w:type="dxa" w:w="60"/>
+              <w:left w:type="dxa" w:w="110"/>
+              <w:bottom w:type="dxa" w:w="60"/>
+              <w:right w:type="dxa" w:w="110"/>
+            </w:tcMar>
+          </w:tcPr>
+          <w:p>
+            <w:r>
+              <w:rPr>
+                <w:rFonts w:ascii="Arial" w:cs="Arial" w:eastAsia="Arial" w:hAnsi="Arial"/>
+                <w:sz w:val="18"/>
+                <w:szCs w:val="18"/>
+              </w:rPr>
+              <w:t xml:space="preserve">96.96% ± 1.09</w:t>
+            </w:r>
+          </w:p>
+        </w:tc>
+        <w:tc>
+          <w:tcPr>
+            <w:tcW w:type="dxa" w:w="3120"/>
+            <w:tcBorders>
+              <w:top w:val="single" w:color="CCCCCC" w:sz="1"/>
+              <w:left w:val="single" w:color="CCCCCC" w:sz="1"/>
+              <w:bottom w:val="single" w:color="CCCCCC" w:sz="1"/>
+              <w:right w:val="single" w:color="CCCCCC" w:sz="1"/>
+            </w:tcBorders>
+            <w:tcMar>
+              <w:top w:type="dxa" w:w="60"/>
+              <w:left w:type="dxa" w:w="110"/>
+              <w:bottom w:type="dxa" w:w="60"/>
+              <w:right w:type="dxa" w:w="110"/>
+            </w:tcMar>
+          </w:tcPr>
+          <w:p>
+            <w:r>
+              <w:rPr>
+                <w:rFonts w:ascii="Arial" w:cs="Arial" w:eastAsia="Arial" w:hAnsi="Arial"/>
+                <w:sz w:val="18"/>
+                <w:szCs w:val="18"/>
+              </w:rPr>
+              <w:t xml:space="preserve">97.10% ± 1.03</w:t>
+            </w:r>
+          </w:p>
+        </w:tc>
+      </w:tr>
+      <w:tr>
+        <w:tc>
+          <w:tcPr>
+            <w:tcW w:type="dxa" w:w="3120"/>
+            <w:tcBorders>
+              <w:top w:val="single" w:color="CCCCCC" w:sz="1"/>
+              <w:left w:val="single" w:color="CCCCCC" w:sz="1"/>
+              <w:bottom w:val="single" w:color="CCCCCC" w:sz="1"/>
+              <w:right w:val="single" w:color="CCCCCC" w:sz="1"/>
+            </w:tcBorders>
+            <w:tcMar>
+              <w:top w:type="dxa" w:w="60"/>
+              <w:left w:type="dxa" w:w="110"/>
+              <w:bottom w:type="dxa" w:w="60"/>
+              <w:right w:type="dxa" w:w="110"/>
+            </w:tcMar>
+          </w:tcPr>
+          <w:p>
+            <w:r>
+              <w:rPr>
+                <w:rFonts w:ascii="Arial" w:cs="Arial" w:eastAsia="Arial" w:hAnsi="Arial"/>
+                <w:sz w:val="18"/>
+                <w:szCs w:val="18"/>
+              </w:rPr>
+              <w:t xml:space="preserve">Cross-domain AUC</w:t>
+            </w:r>
+          </w:p>
+        </w:tc>
+        <w:tc>
+          <w:tcPr>
+            <w:tcW w:type="dxa" w:w="3120"/>
+            <w:tcBorders>
+              <w:top w:val="single" w:color="CCCCCC" w:sz="1"/>
+              <w:left w:val="single" w:color="CCCCCC" w:sz="1"/>
+              <w:bottom w:val="single" w:color="CCCCCC" w:sz="1"/>
+              <w:right w:val="single" w:color="CCCCCC" w:sz="1"/>
+            </w:tcBorders>
+            <w:tcMar>
+              <w:top w:type="dxa" w:w="60"/>
+              <w:left w:type="dxa" w:w="110"/>
+              <w:bottom w:type="dxa" w:w="60"/>
+              <w:right w:type="dxa" w:w="110"/>
+            </w:tcMar>
+          </w:tcPr>
+          <w:p>
+            <w:r>
+              <w:rPr>
+                <w:rFonts w:ascii="Arial" w:cs="Arial" w:eastAsia="Arial" w:hAnsi="Arial"/>
+                <w:sz w:val="18"/>
+                <w:szCs w:val="18"/>
+              </w:rPr>
+              <w:t xml:space="preserve">99.79% ± 0.02</w:t>
+            </w:r>
+          </w:p>
+        </w:tc>
+        <w:tc>
+          <w:tcPr>
+            <w:tcW w:type="dxa" w:w="3120"/>
+            <w:tcBorders>
+              <w:top w:val="single" w:color="CCCCCC" w:sz="1"/>
+              <w:left w:val="single" w:color="CCCCCC" w:sz="1"/>
+              <w:bottom w:val="single" w:color="CCCCCC" w:sz="1"/>
+              <w:right w:val="single" w:color="CCCCCC" w:sz="1"/>
+            </w:tcBorders>
+            <w:tcMar>
+              <w:top w:type="dxa" w:w="60"/>
+              <w:left w:type="dxa" w:w="110"/>
+              <w:bottom w:type="dxa" w:w="60"/>
+              <w:right w:type="dxa" w:w="110"/>
+            </w:tcMar>
+          </w:tcPr>
+          <w:p>
+            <w:r>
+              <w:rPr>
+                <w:rFonts w:ascii="Arial" w:cs="Arial" w:eastAsia="Arial" w:hAnsi="Arial"/>
+                <w:sz w:val="18"/>
+                <w:szCs w:val="18"/>
+              </w:rPr>
+              <w:t xml:space="preserve">99.93% ± 0.05</w:t>
+            </w:r>
+          </w:p>
+        </w:tc>
+      </w:tr>
+      <w:tr>
+        <w:tc>
+          <w:tcPr>
+            <w:tcW w:type="dxa" w:w="3120"/>
+            <w:tcBorders>
+              <w:top w:val="single" w:color="CCCCCC" w:sz="1"/>
+              <w:left w:val="single" w:color="CCCCCC" w:sz="1"/>
+              <w:bottom w:val="single" w:color="CCCCCC" w:sz="1"/>
+              <w:right w:val="single" w:color="CCCCCC" w:sz="1"/>
+            </w:tcBorders>
+            <w:tcMar>
+              <w:top w:type="dxa" w:w="60"/>
+              <w:left w:type="dxa" w:w="110"/>
+              <w:bottom w:type="dxa" w:w="60"/>
+              <w:right w:type="dxa" w:w="110"/>
+            </w:tcMar>
+          </w:tcPr>
+          <w:p>
+            <w:r>
+              <w:rPr>
+                <w:rFonts w:ascii="Arial" w:cs="Arial" w:eastAsia="Arial" w:hAnsi="Arial"/>
+                <w:sz w:val="18"/>
+                <w:szCs w:val="18"/>
+              </w:rPr>
+              <w:t xml:space="preserve">Cross-domain EER</w:t>
+            </w:r>
+          </w:p>
+        </w:tc>
+        <w:tc>
+          <w:tcPr>
+            <w:tcW w:type="dxa" w:w="3120"/>
+            <w:tcBorders>
+              <w:top w:val="single" w:color="CCCCCC" w:sz="1"/>
+              <w:left w:val="single" w:color="CCCCCC" w:sz="1"/>
+              <w:bottom w:val="single" w:color="CCCCCC" w:sz="1"/>
+              <w:right w:val="single" w:color="CCCCCC" w:sz="1"/>
+            </w:tcBorders>
+            <w:tcMar>
+              <w:top w:type="dxa" w:w="60"/>
+              <w:left w:type="dxa" w:w="110"/>
+              <w:bottom w:type="dxa" w:w="60"/>
+              <w:right w:type="dxa" w:w="110"/>
+            </w:tcMar>
+          </w:tcPr>
+          <w:p>
+            <w:r>
+              <w:rPr>
+                <w:rFonts w:ascii="Arial" w:cs="Arial" w:eastAsia="Arial" w:hAnsi="Arial"/>
+                <w:sz w:val="18"/>
+                <w:szCs w:val="18"/>
+              </w:rPr>
+              <w:t xml:space="preserve">2.16% ± 0.15</w:t>
+            </w:r>
+          </w:p>
+        </w:tc>
+        <w:tc>
+          <w:tcPr>
+            <w:tcW w:type="dxa" w:w="3120"/>
+            <w:tcBorders>
+              <w:top w:val="single" w:color="CCCCCC" w:sz="1"/>
+              <w:left w:val="single" w:color="CCCCCC" w:sz="1"/>
+              <w:bottom w:val="single" w:color="CCCCCC" w:sz="1"/>
+              <w:right w:val="single" w:color="CCCCCC" w:sz="1"/>
+            </w:tcBorders>
+            <w:tcMar>
+              <w:top w:type="dxa" w:w="60"/>
+              <w:left w:type="dxa" w:w="110"/>
+              <w:bottom w:type="dxa" w:w="60"/>
+              <w:right w:type="dxa" w:w="110"/>
+            </w:tcMar>
+          </w:tcPr>
+          <w:p>
+            <w:r>
+              <w:rPr>
+                <w:rFonts w:ascii="Arial" w:cs="Arial" w:eastAsia="Arial" w:hAnsi="Arial"/>
+                <w:sz w:val="18"/>
+                <w:szCs w:val="18"/>
+              </w:rPr>
+              <w:t xml:space="preserve">1.29% ± 0.68</w:t>
+            </w:r>
+          </w:p>
+        </w:tc>
+      </w:tr>
+    </w:tbl>
+    <w:p>
+      <w:pPr>
+        <w:spacing w:after="120" w:before="0"/>
+      </w:pPr>
+      <w:r>
+        <w:rPr>
+          <w:b/>
+          <w:bCs/>
+          <w:sz w:val="21"/>
+          <w:szCs w:val="21"/>
+        </w:rPr>
+        <w:t xml:space="preserve">Verdict: reproduced (very close). </w:t>
+      </w:r>
+      <w:r>
+        <w:rPr>
+          <w:sz w:val="21"/>
+          <w:szCs w:val="21"/>
+        </w:rPr>
+        <w:t xml:space="preserve">Cross-domain accuracy (97.10%) essentially equals the paper's (96.96%), and AUC/EER match or improve on it. The two German CNNs (ResNet-18 ~97.0%, ResNet-50 ~97.1%) are mutually consistent.</w:t>
+      </w:r>
+    </w:p>
+    <w:p>
+      <w:pPr>
         <w:pStyle w:val="Heading1"/>
       </w:pPr>
       <w:r>
@@ -4015,7 +5259,7 @@
           <w:sz w:val="21"/>
           <w:szCs w:val="21"/>
         </w:rPr>
-        <w:t xml:space="preserve">Batch size 64 instead of 200 for ResNet-18 (laptop memory). Restore 200 on a GPU server.</w:t>
+        <w:t xml:space="preserve">Reduced batch sizes for laptop memory: ResNet-18 64 (paper 200), ResNet-50 32 (paper 120). Restore the paper's values on a GPU server.</w:t>
       </w:r>
     </w:p>
     <w:p>
@@ -4164,6 +5408,23 @@
     </w:p>
     <w:p>
       <w:pPr>
+        <w:pStyle w:val="ListParagraph"/>
+        <w:numPr>
+          <w:ilvl w:val="0"/>
+          <w:numId w:val="3"/>
+        </w:numPr>
+        <w:spacing w:after="70"/>
+      </w:pPr>
+      <w:r>
+        <w:rPr>
+          <w:sz w:val="21"/>
+          <w:szCs w:val="21"/>
+        </w:rPr>
+        <w:t xml:space="preserve">Model-viability boundary on Apple MPS: ResNet-18 and ResNet-50 run comfortably; AST (transformer) runs for short tests but exhausts laptop memory on the full dataset (observed ~23 GB resident, process stalled/swapping, no progress). AST and the larger SSL models (wav2vec2, Whisper) are therefore GPU-server jobs, not laptop jobs. AST was confirmed to train correctly for two epochs on MPS (in-domain ACC 96.6% at epoch 2) before the memory stall, so the code path is valid.</w:t>
+      </w:r>
+    </w:p>
+    <w:p>
+      <w:pPr>
         <w:pStyle w:val="Heading1"/>
       </w:pPr>
       <w:r>
@@ -4272,7 +5533,7 @@
           <w:sz w:val="21"/>
           <w:szCs w:val="21"/>
         </w:rPr>
-        <w:t xml:space="preserve">In progress: German ResNet-50 (3 runs) on the Mac; then AST, SepTr, wav2vec2 to cover the model axis.</w:t>
+        <w:t xml:space="preserve">Done: German ResNet-18 and ResNet-50 (3 runs each) reproduced on the Mac. AST attempted on the Mac but is server-only (memory). The Mac reproduction phase is considered complete.</w:t>
       </w:r>
     </w:p>
     <w:p>
@@ -4289,7 +5550,7 @@
           <w:sz w:val="21"/>
           <w:szCs w:val="21"/>
         </w:rPr>
-        <w:t xml:space="preserve">Parallel: obtain GPU-server access (cost/allocation) for the full 7-language x 6-model x 3-run sweep at the paper's batch size 200.</w:t>
+        <w:t xml:space="preserve">Full-table sweep prepared for a GPU server (LIST) via a personal GitHub repo; config generator now covers all 6 models, but wav2vec2 and Whisper+MLP still require wiring into the model code (with documented checkpoint assumptions) before those two rows can run.</w:t>
       </w:r>
     </w:p>
     <w:p>
@@ -4306,7 +5567,7 @@
           <w:sz w:val="21"/>
           <w:szCs w:val="21"/>
         </w:rPr>
-        <w:t xml:space="preserve">Next methodological step (Raja): cross-dataset testing — train on one dataset, evaluate on a different one (e.g. ASVspoof &lt;-&gt; XMAD-Bench).</w:t>
+        <w:t xml:space="preserve">Parallel: obtain GPU-server access (cost/allocation) for the full 7-language x 6-model x 3-run sweep at the paper's batch size 200.</w:t>
       </w:r>
     </w:p>
     <w:p>
@@ -4323,345 +5584,24 @@
           <w:sz w:val="21"/>
           <w:szCs w:val="21"/>
         </w:rPr>
-        <w:t xml:space="preserve">Keep in mind (later): dialect testing (AFAD-MSA / ArFake) and stricter real-world security metrics.</w:t>
-      </w:r>
-    </w:p>
-    <w:p>
-      <w:pPr>
-        <w:pageBreakBefore/>
-      </w:pPr>
-      <w:r>
-        <w:t xml:space="preserve"/>
-      </w:r>
-    </w:p>
-    <w:p>
-      <w:pPr>
-        <w:pStyle w:val="Heading1"/>
-      </w:pPr>
-      <w:r>
-        <w:t xml:space="preserve">Appendix A — Console captures</w:t>
-      </w:r>
-    </w:p>
-    <w:p>
-      <w:pPr>
-        <w:spacing w:after="120" w:before="0"/>
+        <w:t xml:space="preserve">Next methodological step (Raja): cross-dataset testing — train on one dataset, evaluate on a different one (e.g. ASVspoof &lt;-&gt; XMAD-Bench).</w:t>
+      </w:r>
+    </w:p>
+    <w:p>
+      <w:pPr>
+        <w:pStyle w:val="ListParagraph"/>
+        <w:numPr>
+          <w:ilvl w:val="0"/>
+          <w:numId w:val="5"/>
+        </w:numPr>
+        <w:spacing w:after="70"/>
       </w:pPr>
       <w:r>
         <w:rPr>
           <w:sz w:val="21"/>
           <w:szCs w:val="21"/>
         </w:rPr>
-        <w:t xml:space="preserve">Terminal captures of the key errors and results recorded during this reproduction (reproduced verbatim from the run console). They document both the failures encountered before the fixes and the final reproduced numbers.</w:t>
-      </w:r>
-    </w:p>
-    <w:p>
-      <w:pPr>
-        <w:spacing w:after="40" w:before="120"/>
-        <w:jc w:val="center"/>
-      </w:pPr>
-      <w:r>
-        <w:drawing>
-          <wp:inline distT="0" distB="0" distL="0" distR="0">
-            <wp:extent cx="5905500" cy="1866900"/>
-            <wp:effectExtent t="0" r="0" b="0" l="0"/>
-            <wp:docPr id="1" name="cap_conda_error.png" descr="conda could not reach Anaconda servers (network blocked) — prompted the switch to Python venv." title="conda could not reach Anaconda servers (network blocked) — prompted the switch to Python venv."/>
-            <wp:cNvGraphicFramePr>
-              <a:graphicFrameLocks xmlns:a="http://schemas.openxmlformats.org/drawingml/2006/main" noChangeAspect="1"/>
-            </wp:cNvGraphicFramePr>
-            <a:graphic xmlns:a="http://schemas.openxmlformats.org/drawingml/2006/main">
-              <a:graphicData uri="http://schemas.openxmlformats.org/drawingml/2006/picture">
-                <pic:pic xmlns:pic="http://schemas.openxmlformats.org/drawingml/2006/picture">
-                  <pic:nvPicPr>
-                    <pic:cNvPr id="0" name="" descr=""/>
-                    <pic:cNvPicPr>
-                      <a:picLocks noChangeAspect="1" noChangeArrowheads="1"/>
-                    </pic:cNvPicPr>
-                  </pic:nvPicPr>
-                  <pic:blipFill>
-                    <a:blip r:embed="rId7" cstate="none"/>
-                    <a:srcRect/>
-                    <a:stretch>
-                      <a:fillRect/>
-                    </a:stretch>
-                  </pic:blipFill>
-                  <pic:spPr bwMode="auto">
-                    <a:xfrm>
-                      <a:off x="0" y="0"/>
-                      <a:ext cx="5905500" cy="1866900"/>
-                    </a:xfrm>
-                    <a:prstGeom prst="rect">
-                      <a:avLst/>
-                    </a:prstGeom>
-                  </pic:spPr>
-                </pic:pic>
-              </a:graphicData>
-            </a:graphic>
-          </wp:inline>
-        </w:drawing>
-      </w:r>
-    </w:p>
-    <w:p>
-      <w:pPr>
-        <w:spacing w:after="160"/>
-        <w:jc w:val="center"/>
-      </w:pPr>
-      <w:r>
-        <w:rPr>
-          <w:i/>
-          <w:iCs/>
-          <w:color w:val="555555"/>
-          <w:sz w:val="18"/>
-          <w:szCs w:val="18"/>
-        </w:rPr>
-        <w:t xml:space="preserve">Figure A1. conda could not reach Anaconda servers (network blocked) — prompted the switch to Python venv.</w:t>
-      </w:r>
-    </w:p>
-    <w:p>
-      <w:pPr>
-        <w:spacing w:after="40" w:before="120"/>
-        <w:jc w:val="center"/>
-      </w:pPr>
-      <w:r>
-        <w:drawing>
-          <wp:inline distT="0" distB="0" distL="0" distR="0">
-            <wp:extent cx="5905500" cy="1866900"/>
-            <wp:effectExtent t="0" r="0" b="0" l="0"/>
-            <wp:docPr id="1" name="cap_torchaudio_error.png" descr="Import collision: root utils.py shadows detection/utils/, causing a spurious torchaudio error (before Fix 1)." title="Import collision: root utils.py shadows detection/utils/, causing a spurious torchaudio error (before Fix 1)."/>
-            <wp:cNvGraphicFramePr>
-              <a:graphicFrameLocks xmlns:a="http://schemas.openxmlformats.org/drawingml/2006/main" noChangeAspect="1"/>
-            </wp:cNvGraphicFramePr>
-            <a:graphic xmlns:a="http://schemas.openxmlformats.org/drawingml/2006/main">
-              <a:graphicData uri="http://schemas.openxmlformats.org/drawingml/2006/picture">
-                <pic:pic xmlns:pic="http://schemas.openxmlformats.org/drawingml/2006/picture">
-                  <pic:nvPicPr>
-                    <pic:cNvPr id="0" name="" descr=""/>
-                    <pic:cNvPicPr>
-                      <a:picLocks noChangeAspect="1" noChangeArrowheads="1"/>
-                    </pic:cNvPicPr>
-                  </pic:nvPicPr>
-                  <pic:blipFill>
-                    <a:blip r:embed="rId8" cstate="none"/>
-                    <a:srcRect/>
-                    <a:stretch>
-                      <a:fillRect/>
-                    </a:stretch>
-                  </pic:blipFill>
-                  <pic:spPr bwMode="auto">
-                    <a:xfrm>
-                      <a:off x="0" y="0"/>
-                      <a:ext cx="5905500" cy="1866900"/>
-                    </a:xfrm>
-                    <a:prstGeom prst="rect">
-                      <a:avLst/>
-                    </a:prstGeom>
-                  </pic:spPr>
-                </pic:pic>
-              </a:graphicData>
-            </a:graphic>
-          </wp:inline>
-        </w:drawing>
-      </w:r>
-    </w:p>
-    <w:p>
-      <w:pPr>
-        <w:spacing w:after="160"/>
-        <w:jc w:val="center"/>
-      </w:pPr>
-      <w:r>
-        <w:rPr>
-          <w:i/>
-          <w:iCs/>
-          <w:color w:val="555555"/>
-          <w:sz w:val="18"/>
-          <w:szCs w:val="18"/>
-        </w:rPr>
-        <w:t xml:space="preserve">Figure A2. Import collision: root utils.py shadows detection/utils/, causing a spurious torchaudio error (before Fix 1).</w:t>
-      </w:r>
-    </w:p>
-    <w:p>
-      <w:pPr>
-        <w:spacing w:after="40" w:before="120"/>
-        <w:jc w:val="center"/>
-      </w:pPr>
-      <w:r>
-        <w:drawing>
-          <wp:inline distT="0" distB="0" distL="0" distR="0">
-            <wp:extent cx="5905500" cy="1123950"/>
-            <wp:effectExtent t="0" r="0" b="0" l="0"/>
-            <wp:docPr id="1" name="cap_mps_error.png" descr="Apple GPU (MPS) float64 error before Fix 4." title="Apple GPU (MPS) float64 error before Fix 4."/>
-            <wp:cNvGraphicFramePr>
-              <a:graphicFrameLocks xmlns:a="http://schemas.openxmlformats.org/drawingml/2006/main" noChangeAspect="1"/>
-            </wp:cNvGraphicFramePr>
-            <a:graphic xmlns:a="http://schemas.openxmlformats.org/drawingml/2006/main">
-              <a:graphicData uri="http://schemas.openxmlformats.org/drawingml/2006/picture">
-                <pic:pic xmlns:pic="http://schemas.openxmlformats.org/drawingml/2006/picture">
-                  <pic:nvPicPr>
-                    <pic:cNvPr id="0" name="" descr=""/>
-                    <pic:cNvPicPr>
-                      <a:picLocks noChangeAspect="1" noChangeArrowheads="1"/>
-                    </pic:cNvPicPr>
-                  </pic:nvPicPr>
-                  <pic:blipFill>
-                    <a:blip r:embed="rId9" cstate="none"/>
-                    <a:srcRect/>
-                    <a:stretch>
-                      <a:fillRect/>
-                    </a:stretch>
-                  </pic:blipFill>
-                  <pic:spPr bwMode="auto">
-                    <a:xfrm>
-                      <a:off x="0" y="0"/>
-                      <a:ext cx="5905500" cy="1123950"/>
-                    </a:xfrm>
-                    <a:prstGeom prst="rect">
-                      <a:avLst/>
-                    </a:prstGeom>
-                  </pic:spPr>
-                </pic:pic>
-              </a:graphicData>
-            </a:graphic>
-          </wp:inline>
-        </w:drawing>
-      </w:r>
-    </w:p>
-    <w:p>
-      <w:pPr>
-        <w:spacing w:after="160"/>
-        <w:jc w:val="center"/>
-      </w:pPr>
-      <w:r>
-        <w:rPr>
-          <w:i/>
-          <w:iCs/>
-          <w:color w:val="555555"/>
-          <w:sz w:val="18"/>
-          <w:szCs w:val="18"/>
-        </w:rPr>
-        <w:t xml:space="preserve">Figure A3. Apple GPU (MPS) float64 error before Fix 4.</w:t>
-      </w:r>
-    </w:p>
-    <w:p>
-      <w:pPr>
-        <w:spacing w:after="40" w:before="120"/>
-        <w:jc w:val="center"/>
-      </w:pPr>
-      <w:r>
-        <w:drawing>
-          <wp:inline distT="0" distB="0" distL="0" distR="0">
-            <wp:extent cx="5905500" cy="1571625"/>
-            <wp:effectExtent t="0" r="0" b="0" l="0"/>
-            <wp:docPr id="1" name="cap_smoke_result.png" descr="Smoke test (German, ResNet-18, 3 epochs): in-domain ~98.8% vs cross-domain 82.6%." title="Smoke test (German, ResNet-18, 3 epochs): in-domain ~98.8% vs cross-domain 82.6%."/>
-            <wp:cNvGraphicFramePr>
-              <a:graphicFrameLocks xmlns:a="http://schemas.openxmlformats.org/drawingml/2006/main" noChangeAspect="1"/>
-            </wp:cNvGraphicFramePr>
-            <a:graphic xmlns:a="http://schemas.openxmlformats.org/drawingml/2006/main">
-              <a:graphicData uri="http://schemas.openxmlformats.org/drawingml/2006/picture">
-                <pic:pic xmlns:pic="http://schemas.openxmlformats.org/drawingml/2006/picture">
-                  <pic:nvPicPr>
-                    <pic:cNvPr id="0" name="" descr=""/>
-                    <pic:cNvPicPr>
-                      <a:picLocks noChangeAspect="1" noChangeArrowheads="1"/>
-                    </pic:cNvPicPr>
-                  </pic:nvPicPr>
-                  <pic:blipFill>
-                    <a:blip r:embed="rId10" cstate="none"/>
-                    <a:srcRect/>
-                    <a:stretch>
-                      <a:fillRect/>
-                    </a:stretch>
-                  </pic:blipFill>
-                  <pic:spPr bwMode="auto">
-                    <a:xfrm>
-                      <a:off x="0" y="0"/>
-                      <a:ext cx="5905500" cy="1571625"/>
-                    </a:xfrm>
-                    <a:prstGeom prst="rect">
-                      <a:avLst/>
-                    </a:prstGeom>
-                  </pic:spPr>
-                </pic:pic>
-              </a:graphicData>
-            </a:graphic>
-          </wp:inline>
-        </w:drawing>
-      </w:r>
-    </w:p>
-    <w:p>
-      <w:pPr>
-        <w:spacing w:after="160"/>
-        <w:jc w:val="center"/>
-      </w:pPr>
-      <w:r>
-        <w:rPr>
-          <w:i/>
-          <w:iCs/>
-          <w:color w:val="555555"/>
-          <w:sz w:val="18"/>
-          <w:szCs w:val="18"/>
-        </w:rPr>
-        <w:t xml:space="preserve">Figure A4. Smoke test (German, ResNet-18, 3 epochs): in-domain ~98.8% vs cross-domain 82.6%.</w:t>
-      </w:r>
-    </w:p>
-    <w:p>
-      <w:pPr>
-        <w:spacing w:after="40" w:before="120"/>
-        <w:jc w:val="center"/>
-      </w:pPr>
-      <w:r>
-        <w:drawing>
-          <wp:inline distT="0" distB="0" distL="0" distR="0">
-            <wp:extent cx="5905500" cy="1714500"/>
-            <wp:effectExtent t="0" r="0" b="0" l="0"/>
-            <wp:docPr id="1" name="cap_full_runs.png" descr="Full German ResNet-18, three 20-epoch runs — final in-domain and cross-domain results." title="Full German ResNet-18, three 20-epoch runs — final in-domain and cross-domain results."/>
-            <wp:cNvGraphicFramePr>
-              <a:graphicFrameLocks xmlns:a="http://schemas.openxmlformats.org/drawingml/2006/main" noChangeAspect="1"/>
-            </wp:cNvGraphicFramePr>
-            <a:graphic xmlns:a="http://schemas.openxmlformats.org/drawingml/2006/main">
-              <a:graphicData uri="http://schemas.openxmlformats.org/drawingml/2006/picture">
-                <pic:pic xmlns:pic="http://schemas.openxmlformats.org/drawingml/2006/picture">
-                  <pic:nvPicPr>
-                    <pic:cNvPr id="0" name="" descr=""/>
-                    <pic:cNvPicPr>
-                      <a:picLocks noChangeAspect="1" noChangeArrowheads="1"/>
-                    </pic:cNvPicPr>
-                  </pic:nvPicPr>
-                  <pic:blipFill>
-                    <a:blip r:embed="rId11" cstate="none"/>
-                    <a:srcRect/>
-                    <a:stretch>
-                      <a:fillRect/>
-                    </a:stretch>
-                  </pic:blipFill>
-                  <pic:spPr bwMode="auto">
-                    <a:xfrm>
-                      <a:off x="0" y="0"/>
-                      <a:ext cx="5905500" cy="1714500"/>
-                    </a:xfrm>
-                    <a:prstGeom prst="rect">
-                      <a:avLst/>
-                    </a:prstGeom>
-                  </pic:spPr>
-                </pic:pic>
-              </a:graphicData>
-            </a:graphic>
-          </wp:inline>
-        </w:drawing>
-      </w:r>
-    </w:p>
-    <w:p>
-      <w:pPr>
-        <w:spacing w:after="160"/>
-        <w:jc w:val="center"/>
-      </w:pPr>
-      <w:r>
-        <w:rPr>
-          <w:i/>
-          <w:iCs/>
-          <w:color w:val="555555"/>
-          <w:sz w:val="18"/>
-          <w:szCs w:val="18"/>
-        </w:rPr>
-        <w:t xml:space="preserve">Figure A5. Full German ResNet-18, three 20-epoch runs — final in-domain and cross-domain results.</w:t>
+        <w:t xml:space="preserve">Keep in mind (later): dialect testing (AFAD-MSA / ArFake) and stricter real-world security metrics.</w:t>
       </w:r>
     </w:p>
     <w:sectPr>

</xml_diff>